<commit_message>
Tugas Pertemuan 2, dan DOCX Untuk Kode VS Code
</commit_message>
<xml_diff>
--- a/Alwan Ahmad N_5520125034_TugasP1.docx
+++ b/Alwan Ahmad N_5520125034_TugasP1.docx
@@ -25,7 +25,15 @@
           <w:bCs/>
           <w:color w:val="EE0000"/>
         </w:rPr>
-        <w:t>TUGAS PRAKTIKUM PERTEMUAN 1</w:t>
+        <w:t xml:space="preserve">TUGAS PRAKTIKUM PERTEMUAN </w:t>
+      </w:r>
+      <w:r>
+        <w:rPr>
+          <w:b/>
+          <w:bCs/>
+          <w:color w:val="EE0000"/>
+        </w:rPr>
+        <w:t>2</w:t>
       </w:r>
     </w:p>
     <w:p>
@@ -61,31 +69,14 @@
         <w:t>: 3</w:t>
       </w:r>
     </w:p>
+    <w:p/>
     <w:p>
-      <w:pPr>
-        <w:pStyle w:val="ListParagraph"/>
-        <w:numPr>
-          <w:ilvl w:val="0"/>
-          <w:numId w:val="1"/>
-        </w:numPr>
-      </w:pPr>
-      <w:r>
-        <w:t>Tampilan setelah membuat Fork</w:t>
-      </w:r>
-    </w:p>
-    <w:p>
-      <w:pPr>
-        <w:pStyle w:val="ListParagraph"/>
-      </w:pPr>
-      <w:r>
-        <w:rPr>
-          <w:noProof/>
-        </w:rPr>
+      <w:r>
         <w:drawing>
-          <wp:inline distT="0" distB="0" distL="0" distR="0" wp14:anchorId="51E06A33" wp14:editId="5ADFB6B9">
-            <wp:extent cx="5731510" cy="2583180"/>
-            <wp:effectExtent l="0" t="0" r="2540" b="7620"/>
-            <wp:docPr id="1382572511" name="Picture 1"/>
+          <wp:inline distT="0" distB="0" distL="0" distR="0" wp14:anchorId="6583DE9A" wp14:editId="7F780A29">
+            <wp:extent cx="5731510" cy="2950845"/>
+            <wp:effectExtent l="0" t="0" r="2540" b="1905"/>
+            <wp:docPr id="2054145467" name="Picture 1"/>
             <wp:cNvGraphicFramePr>
               <a:graphicFrameLocks xmlns:a="http://schemas.openxmlformats.org/drawingml/2006/main" noChangeAspect="1"/>
             </wp:cNvGraphicFramePr>
@@ -93,7 +84,7 @@
               <a:graphicData uri="http://schemas.openxmlformats.org/drawingml/2006/picture">
                 <pic:pic xmlns:pic="http://schemas.openxmlformats.org/drawingml/2006/picture">
                   <pic:nvPicPr>
-                    <pic:cNvPr id="1382572511" name=""/>
+                    <pic:cNvPr id="2054145467" name=""/>
                     <pic:cNvPicPr/>
                   </pic:nvPicPr>
                   <pic:blipFill>
@@ -105,7 +96,7 @@
                   <pic:spPr>
                     <a:xfrm>
                       <a:off x="0" y="0"/>
-                      <a:ext cx="5731510" cy="2583180"/>
+                      <a:ext cx="5731510" cy="2950845"/>
                     </a:xfrm>
                     <a:prstGeom prst="rect">
                       <a:avLst/>
@@ -131,28 +122,18 @@
     <w:p>
       <w:pPr>
         <w:pStyle w:val="ListParagraph"/>
-        <w:numPr>
-          <w:ilvl w:val="0"/>
-          <w:numId w:val="1"/>
-        </w:numPr>
-      </w:pPr>
-      <w:r>
-        <w:rPr>
-          <w:noProof/>
-        </w:rPr>
+      </w:pPr>
+    </w:p>
+    <w:p/>
+    <w:p/>
+    <w:p>
+      <w:r>
+        <w:lastRenderedPageBreak/>
         <w:drawing>
-          <wp:anchor distT="0" distB="0" distL="114300" distR="114300" simplePos="0" relativeHeight="251659264" behindDoc="0" locked="0" layoutInCell="1" allowOverlap="1" wp14:anchorId="38245B30" wp14:editId="44AA92E4">
-            <wp:simplePos x="0" y="0"/>
-            <wp:positionH relativeFrom="column">
-              <wp:posOffset>457200</wp:posOffset>
-            </wp:positionH>
-            <wp:positionV relativeFrom="paragraph">
-              <wp:posOffset>527685</wp:posOffset>
-            </wp:positionV>
-            <wp:extent cx="5731510" cy="1210945"/>
-            <wp:effectExtent l="0" t="0" r="2540" b="8255"/>
-            <wp:wrapSquare wrapText="bothSides"/>
-            <wp:docPr id="978104046" name="Picture 1"/>
+          <wp:inline distT="0" distB="0" distL="0" distR="0" wp14:anchorId="3737ECAF" wp14:editId="0AEFFDE4">
+            <wp:extent cx="5731510" cy="3048000"/>
+            <wp:effectExtent l="0" t="0" r="2540" b="0"/>
+            <wp:docPr id="1078808080" name="Picture 1"/>
             <wp:cNvGraphicFramePr>
               <a:graphicFrameLocks xmlns:a="http://schemas.openxmlformats.org/drawingml/2006/main" noChangeAspect="1"/>
             </wp:cNvGraphicFramePr>
@@ -160,17 +141,11 @@
               <a:graphicData uri="http://schemas.openxmlformats.org/drawingml/2006/picture">
                 <pic:pic xmlns:pic="http://schemas.openxmlformats.org/drawingml/2006/picture">
                   <pic:nvPicPr>
-                    <pic:cNvPr id="978104046" name=""/>
+                    <pic:cNvPr id="1078808080" name=""/>
                     <pic:cNvPicPr/>
                   </pic:nvPicPr>
                   <pic:blipFill>
-                    <a:blip r:embed="rId6" cstate="print">
-                      <a:extLst>
-                        <a:ext uri="{28A0092B-C50C-407E-A947-70E740481C1C}">
-                          <a14:useLocalDpi xmlns:a14="http://schemas.microsoft.com/office/drawing/2010/main" val="0"/>
-                        </a:ext>
-                      </a:extLst>
-                    </a:blip>
+                    <a:blip r:embed="rId6"/>
                     <a:stretch>
                       <a:fillRect/>
                     </a:stretch>
@@ -178,7 +153,7 @@
                   <pic:spPr>
                     <a:xfrm>
                       <a:off x="0" y="0"/>
-                      <a:ext cx="5731510" cy="1210945"/>
+                      <a:ext cx="5731510" cy="3048000"/>
                     </a:xfrm>
                     <a:prstGeom prst="rect">
                       <a:avLst/>
@@ -187,43 +162,18 @@
                 </pic:pic>
               </a:graphicData>
             </a:graphic>
-          </wp:anchor>
+          </wp:inline>
         </w:drawing>
       </w:r>
-      <w:r>
-        <w:t>Membuat folder untuk di-clone dengan membuka cmd difolder yang sudah dibuat</w:t>
-      </w:r>
     </w:p>
     <w:p/>
-    <w:p/>
-    <w:p/>
-    <w:p/>
-    <w:p/>
-    <w:p/>
-    <w:p/>
     <w:p>
-      <w:pPr>
-        <w:pStyle w:val="ListParagraph"/>
-        <w:numPr>
-          <w:ilvl w:val="0"/>
-          <w:numId w:val="1"/>
-        </w:numPr>
-      </w:pPr>
-      <w:r>
-        <w:t>Mengisi file index.html yang tersedia dengan biodata sendiri</w:t>
-      </w:r>
-    </w:p>
-    <w:p>
-      <w:r>
-        <w:rPr>
-          <w:noProof/>
-        </w:rPr>
-        <w:lastRenderedPageBreak/>
+      <w:r>
         <w:drawing>
-          <wp:inline distT="0" distB="0" distL="0" distR="0" wp14:anchorId="411084D1" wp14:editId="1D233AF0">
-            <wp:extent cx="5731510" cy="1975485"/>
-            <wp:effectExtent l="0" t="0" r="2540" b="5715"/>
-            <wp:docPr id="1771429279" name="Picture 1"/>
+          <wp:inline distT="0" distB="0" distL="0" distR="0" wp14:anchorId="7FDDF06D" wp14:editId="7625F33C">
+            <wp:extent cx="5731510" cy="3213100"/>
+            <wp:effectExtent l="0" t="0" r="2540" b="6350"/>
+            <wp:docPr id="163304817" name="Picture 1"/>
             <wp:cNvGraphicFramePr>
               <a:graphicFrameLocks xmlns:a="http://schemas.openxmlformats.org/drawingml/2006/main" noChangeAspect="1"/>
             </wp:cNvGraphicFramePr>
@@ -231,7 +181,7 @@
               <a:graphicData uri="http://schemas.openxmlformats.org/drawingml/2006/picture">
                 <pic:pic xmlns:pic="http://schemas.openxmlformats.org/drawingml/2006/picture">
                   <pic:nvPicPr>
-                    <pic:cNvPr id="1771429279" name=""/>
+                    <pic:cNvPr id="163304817" name=""/>
                     <pic:cNvPicPr/>
                   </pic:nvPicPr>
                   <pic:blipFill>
@@ -243,7 +193,7 @@
                   <pic:spPr>
                     <a:xfrm>
                       <a:off x="0" y="0"/>
-                      <a:ext cx="5731510" cy="1975485"/>
+                      <a:ext cx="5731510" cy="3213100"/>
                     </a:xfrm>
                     <a:prstGeom prst="rect">
                       <a:avLst/>
@@ -256,48 +206,15 @@
         </w:drawing>
       </w:r>
     </w:p>
+    <w:p/>
     <w:p>
-      <w:pPr>
-        <w:rPr>
-          <w:b/>
-          <w:bCs/>
-          <w:color w:val="EE0000"/>
-        </w:rPr>
-      </w:pPr>
-      <w:r>
-        <w:rPr>
-          <w:b/>
-          <w:bCs/>
-          <w:color w:val="EE0000"/>
-        </w:rPr>
-        <w:t>CARA PUSH KE GITHUB</w:t>
-      </w:r>
-    </w:p>
-    <w:p>
-      <w:pPr>
-        <w:pStyle w:val="ListParagraph"/>
-        <w:numPr>
-          <w:ilvl w:val="0"/>
-          <w:numId w:val="2"/>
-        </w:numPr>
-      </w:pPr>
-      <w:r>
-        <w:t>Ketik cmd untuk membuka terminal</w:t>
-      </w:r>
-      <w:r>
-        <w:t xml:space="preserve"> di folder clone</w:t>
-      </w:r>
-    </w:p>
-    <w:p>
-      <w:r>
-        <w:rPr>
-          <w:noProof/>
-        </w:rPr>
+      <w:r>
+        <w:lastRenderedPageBreak/>
         <w:drawing>
-          <wp:inline distT="0" distB="0" distL="0" distR="0" wp14:anchorId="76F81E34" wp14:editId="577ED0A5">
-            <wp:extent cx="5731510" cy="423545"/>
+          <wp:inline distT="0" distB="0" distL="0" distR="0" wp14:anchorId="23A4C859" wp14:editId="407CF447">
+            <wp:extent cx="5731510" cy="3188335"/>
             <wp:effectExtent l="0" t="0" r="2540" b="0"/>
-            <wp:docPr id="1522447074" name="Picture 1"/>
+            <wp:docPr id="111059814" name="Picture 1"/>
             <wp:cNvGraphicFramePr>
               <a:graphicFrameLocks xmlns:a="http://schemas.openxmlformats.org/drawingml/2006/main" noChangeAspect="1"/>
             </wp:cNvGraphicFramePr>
@@ -305,7 +222,7 @@
               <a:graphicData uri="http://schemas.openxmlformats.org/drawingml/2006/picture">
                 <pic:pic xmlns:pic="http://schemas.openxmlformats.org/drawingml/2006/picture">
                   <pic:nvPicPr>
-                    <pic:cNvPr id="1522447074" name=""/>
+                    <pic:cNvPr id="111059814" name=""/>
                     <pic:cNvPicPr/>
                   </pic:nvPicPr>
                   <pic:blipFill>
@@ -317,7 +234,7 @@
                   <pic:spPr>
                     <a:xfrm>
                       <a:off x="0" y="0"/>
-                      <a:ext cx="5731510" cy="423545"/>
+                      <a:ext cx="5731510" cy="3188335"/>
                     </a:xfrm>
                     <a:prstGeom prst="rect">
                       <a:avLst/>
@@ -332,100 +249,12 @@
     </w:p>
     <w:p/>
     <w:p>
-      <w:pPr>
-        <w:pStyle w:val="ListParagraph"/>
-        <w:numPr>
-          <w:ilvl w:val="0"/>
-          <w:numId w:val="2"/>
-        </w:numPr>
-      </w:pPr>
-      <w:r>
-        <w:t>Ketik git add . pada terminal untuk m</w:t>
-      </w:r>
-      <w:r>
-        <w:t>enambahkan seluruh perubahan di direktori</w:t>
-      </w:r>
-      <w:r>
-        <w:t xml:space="preserve"> saat ini lalu klik enter</w:t>
-      </w:r>
-    </w:p>
-    <w:p>
-      <w:pPr>
-        <w:pStyle w:val="ListParagraph"/>
-        <w:numPr>
-          <w:ilvl w:val="0"/>
-          <w:numId w:val="2"/>
-        </w:numPr>
-      </w:pPr>
-      <w:r>
-        <w:t xml:space="preserve">Ketik git commit -m “(ketik apa perubahannya)”  </w:t>
-      </w:r>
-    </w:p>
-    <w:p>
-      <w:pPr>
-        <w:pStyle w:val="ListParagraph"/>
-        <w:numPr>
-          <w:ilvl w:val="0"/>
-          <w:numId w:val="2"/>
-        </w:numPr>
-      </w:pPr>
-      <w:r>
-        <w:t xml:space="preserve">Disini terjadi sebuah fatal, karena </w:t>
-      </w:r>
-      <w:r>
-        <w:t>saya mencoba langsung push ke repository asisten lab</w:t>
-      </w:r>
-      <w:r>
-        <w:t>, bukan kepada repository hasil fork milik saya sendiri. Maka saya menambahkan git remote</w:t>
-      </w:r>
-      <w:r>
-        <w:t xml:space="preserve"> set-url origin</w:t>
-      </w:r>
-      <w:r>
-        <w:t>, dan selain fatal juga yang berkaitan dengan repository asisten lab, disini juga ada</w:t>
-      </w:r>
-      <w:r>
-        <w:t xml:space="preserve"> permission denied karena saya semestinya remove dahulu github user sebelumnya di credential manager</w:t>
-      </w:r>
-    </w:p>
-    <w:p>
-      <w:pPr>
-        <w:pStyle w:val="ListParagraph"/>
-        <w:numPr>
-          <w:ilvl w:val="0"/>
-          <w:numId w:val="2"/>
-        </w:numPr>
-      </w:pPr>
-      <w:r>
-        <w:t xml:space="preserve">Ketik git push origin main </w:t>
-      </w:r>
-    </w:p>
-    <w:p>
-      <w:pPr>
-        <w:pStyle w:val="ListParagraph"/>
-        <w:numPr>
-          <w:ilvl w:val="0"/>
-          <w:numId w:val="2"/>
-        </w:numPr>
-      </w:pPr>
-      <w:r>
-        <w:t>Nah setelah saya git push origin main, ternyata ditolak, dikarenakan saya sebelumnya telah melakukan pull request, ini bisa terjadi karena. Saya sudah mengerjakan tugasnya, namun setelah beres saya baru tahu, bahwa saya juga diwajibkan membuat file dokumen word</w:t>
-      </w:r>
-    </w:p>
-    <w:p>
-      <w:pPr>
-        <w:pStyle w:val="ListParagraph"/>
-      </w:pPr>
-      <w:r>
-        <w:rPr>
-          <w:noProof/>
-        </w:rPr>
-        <w:lastRenderedPageBreak/>
+      <w:r>
         <w:drawing>
-          <wp:inline distT="0" distB="0" distL="0" distR="0" wp14:anchorId="3D9E1DB6" wp14:editId="01F1BA3C">
-            <wp:extent cx="5731510" cy="2865755"/>
-            <wp:effectExtent l="0" t="0" r="2540" b="0"/>
-            <wp:docPr id="1973293400" name="Picture 1"/>
+          <wp:inline distT="0" distB="0" distL="0" distR="0" wp14:anchorId="6E9D3508" wp14:editId="2E6D7562">
+            <wp:extent cx="5731510" cy="3255010"/>
+            <wp:effectExtent l="0" t="0" r="2540" b="2540"/>
+            <wp:docPr id="1553299348" name="Picture 1"/>
             <wp:cNvGraphicFramePr>
               <a:graphicFrameLocks xmlns:a="http://schemas.openxmlformats.org/drawingml/2006/main" noChangeAspect="1"/>
             </wp:cNvGraphicFramePr>
@@ -433,7 +262,7 @@
               <a:graphicData uri="http://schemas.openxmlformats.org/drawingml/2006/picture">
                 <pic:pic xmlns:pic="http://schemas.openxmlformats.org/drawingml/2006/picture">
                   <pic:nvPicPr>
-                    <pic:cNvPr id="1973293400" name=""/>
+                    <pic:cNvPr id="1553299348" name=""/>
                     <pic:cNvPicPr/>
                   </pic:nvPicPr>
                   <pic:blipFill>
@@ -445,7 +274,7 @@
                   <pic:spPr>
                     <a:xfrm>
                       <a:off x="0" y="0"/>
-                      <a:ext cx="5731510" cy="2865755"/>
+                      <a:ext cx="5731510" cy="3255010"/>
                     </a:xfrm>
                     <a:prstGeom prst="rect">
                       <a:avLst/>
@@ -458,33 +287,20 @@
         </w:drawing>
       </w:r>
     </w:p>
+    <w:p/>
+    <w:p/>
+    <w:p/>
+    <w:p/>
+    <w:p/>
+    <w:p/>
     <w:p>
-      <w:pPr>
-        <w:pStyle w:val="ListParagraph"/>
-      </w:pPr>
-    </w:p>
-    <w:p>
-      <w:pPr>
-        <w:pStyle w:val="ListParagraph"/>
-        <w:numPr>
-          <w:ilvl w:val="0"/>
-          <w:numId w:val="2"/>
-        </w:numPr>
-      </w:pPr>
-      <w:r>
-        <w:t>Tampilan setelah di-push</w:t>
-      </w:r>
-    </w:p>
-    <w:p>
-      <w:r>
-        <w:rPr>
-          <w:noProof/>
-        </w:rPr>
+      <w:r>
+        <w:lastRenderedPageBreak/>
         <w:drawing>
-          <wp:inline distT="0" distB="0" distL="0" distR="0" wp14:anchorId="2873FA0D" wp14:editId="2BEEB199">
-            <wp:extent cx="5731510" cy="3102610"/>
-            <wp:effectExtent l="0" t="0" r="2540" b="2540"/>
-            <wp:docPr id="1744412283" name="Picture 1"/>
+          <wp:inline distT="0" distB="0" distL="0" distR="0" wp14:anchorId="0BD6A6F6" wp14:editId="77B504E9">
+            <wp:extent cx="5731510" cy="3158490"/>
+            <wp:effectExtent l="0" t="0" r="2540" b="3810"/>
+            <wp:docPr id="1325501153" name="Picture 1"/>
             <wp:cNvGraphicFramePr>
               <a:graphicFrameLocks xmlns:a="http://schemas.openxmlformats.org/drawingml/2006/main" noChangeAspect="1"/>
             </wp:cNvGraphicFramePr>
@@ -492,7 +308,7 @@
               <a:graphicData uri="http://schemas.openxmlformats.org/drawingml/2006/picture">
                 <pic:pic xmlns:pic="http://schemas.openxmlformats.org/drawingml/2006/picture">
                   <pic:nvPicPr>
-                    <pic:cNvPr id="1744412283" name=""/>
+                    <pic:cNvPr id="1325501153" name=""/>
                     <pic:cNvPicPr/>
                   </pic:nvPicPr>
                   <pic:blipFill>
@@ -504,7 +320,7 @@
                   <pic:spPr>
                     <a:xfrm>
                       <a:off x="0" y="0"/>
-                      <a:ext cx="5731510" cy="3102610"/>
+                      <a:ext cx="5731510" cy="3158490"/>
                     </a:xfrm>
                     <a:prstGeom prst="rect">
                       <a:avLst/>
@@ -517,6 +333,275 @@
         </w:drawing>
       </w:r>
     </w:p>
+    <w:p/>
+    <w:p>
+      <w:r>
+        <w:drawing>
+          <wp:inline distT="0" distB="0" distL="0" distR="0" wp14:anchorId="60BEB162" wp14:editId="593E3C08">
+            <wp:extent cx="5731510" cy="3645535"/>
+            <wp:effectExtent l="0" t="0" r="2540" b="0"/>
+            <wp:docPr id="1295211101" name="Picture 1"/>
+            <wp:cNvGraphicFramePr>
+              <a:graphicFrameLocks xmlns:a="http://schemas.openxmlformats.org/drawingml/2006/main" noChangeAspect="1"/>
+            </wp:cNvGraphicFramePr>
+            <a:graphic xmlns:a="http://schemas.openxmlformats.org/drawingml/2006/main">
+              <a:graphicData uri="http://schemas.openxmlformats.org/drawingml/2006/picture">
+                <pic:pic xmlns:pic="http://schemas.openxmlformats.org/drawingml/2006/picture">
+                  <pic:nvPicPr>
+                    <pic:cNvPr id="1295211101" name=""/>
+                    <pic:cNvPicPr/>
+                  </pic:nvPicPr>
+                  <pic:blipFill>
+                    <a:blip r:embed="rId11"/>
+                    <a:stretch>
+                      <a:fillRect/>
+                    </a:stretch>
+                  </pic:blipFill>
+                  <pic:spPr>
+                    <a:xfrm>
+                      <a:off x="0" y="0"/>
+                      <a:ext cx="5731510" cy="3645535"/>
+                    </a:xfrm>
+                    <a:prstGeom prst="rect">
+                      <a:avLst/>
+                    </a:prstGeom>
+                  </pic:spPr>
+                </pic:pic>
+              </a:graphicData>
+            </a:graphic>
+          </wp:inline>
+        </w:drawing>
+      </w:r>
+    </w:p>
+    <w:p/>
+    <w:p/>
+    <w:p/>
+    <w:p/>
+    <w:p/>
+    <w:p>
+      <w:r>
+        <w:lastRenderedPageBreak/>
+        <w:drawing>
+          <wp:inline distT="0" distB="0" distL="0" distR="0" wp14:anchorId="2E5E3F79" wp14:editId="7E8647B0">
+            <wp:extent cx="5731510" cy="3464560"/>
+            <wp:effectExtent l="0" t="0" r="2540" b="2540"/>
+            <wp:docPr id="1152248558" name="Picture 1"/>
+            <wp:cNvGraphicFramePr>
+              <a:graphicFrameLocks xmlns:a="http://schemas.openxmlformats.org/drawingml/2006/main" noChangeAspect="1"/>
+            </wp:cNvGraphicFramePr>
+            <a:graphic xmlns:a="http://schemas.openxmlformats.org/drawingml/2006/main">
+              <a:graphicData uri="http://schemas.openxmlformats.org/drawingml/2006/picture">
+                <pic:pic xmlns:pic="http://schemas.openxmlformats.org/drawingml/2006/picture">
+                  <pic:nvPicPr>
+                    <pic:cNvPr id="1152248558" name=""/>
+                    <pic:cNvPicPr/>
+                  </pic:nvPicPr>
+                  <pic:blipFill>
+                    <a:blip r:embed="rId12"/>
+                    <a:stretch>
+                      <a:fillRect/>
+                    </a:stretch>
+                  </pic:blipFill>
+                  <pic:spPr>
+                    <a:xfrm>
+                      <a:off x="0" y="0"/>
+                      <a:ext cx="5731510" cy="3464560"/>
+                    </a:xfrm>
+                    <a:prstGeom prst="rect">
+                      <a:avLst/>
+                    </a:prstGeom>
+                  </pic:spPr>
+                </pic:pic>
+              </a:graphicData>
+            </a:graphic>
+          </wp:inline>
+        </w:drawing>
+      </w:r>
+      <w:r>
+        <w:drawing>
+          <wp:inline distT="0" distB="0" distL="0" distR="0" wp14:anchorId="6E6C8215" wp14:editId="74FD2073">
+            <wp:extent cx="5731510" cy="3545840"/>
+            <wp:effectExtent l="0" t="0" r="2540" b="0"/>
+            <wp:docPr id="919637037" name="Picture 1"/>
+            <wp:cNvGraphicFramePr>
+              <a:graphicFrameLocks xmlns:a="http://schemas.openxmlformats.org/drawingml/2006/main" noChangeAspect="1"/>
+            </wp:cNvGraphicFramePr>
+            <a:graphic xmlns:a="http://schemas.openxmlformats.org/drawingml/2006/main">
+              <a:graphicData uri="http://schemas.openxmlformats.org/drawingml/2006/picture">
+                <pic:pic xmlns:pic="http://schemas.openxmlformats.org/drawingml/2006/picture">
+                  <pic:nvPicPr>
+                    <pic:cNvPr id="919637037" name=""/>
+                    <pic:cNvPicPr/>
+                  </pic:nvPicPr>
+                  <pic:blipFill>
+                    <a:blip r:embed="rId13"/>
+                    <a:stretch>
+                      <a:fillRect/>
+                    </a:stretch>
+                  </pic:blipFill>
+                  <pic:spPr>
+                    <a:xfrm>
+                      <a:off x="0" y="0"/>
+                      <a:ext cx="5731510" cy="3545840"/>
+                    </a:xfrm>
+                    <a:prstGeom prst="rect">
+                      <a:avLst/>
+                    </a:prstGeom>
+                  </pic:spPr>
+                </pic:pic>
+              </a:graphicData>
+            </a:graphic>
+          </wp:inline>
+        </w:drawing>
+      </w:r>
+    </w:p>
+    <w:p/>
+    <w:p/>
+    <w:p/>
+    <w:p/>
+    <w:p/>
+    <w:p>
+      <w:r>
+        <w:lastRenderedPageBreak/>
+        <w:drawing>
+          <wp:inline distT="0" distB="0" distL="0" distR="0" wp14:anchorId="2B8F2FF3" wp14:editId="4E7DB78B">
+            <wp:extent cx="5731510" cy="3168015"/>
+            <wp:effectExtent l="0" t="0" r="2540" b="0"/>
+            <wp:docPr id="1225564847" name="Picture 1"/>
+            <wp:cNvGraphicFramePr>
+              <a:graphicFrameLocks xmlns:a="http://schemas.openxmlformats.org/drawingml/2006/main" noChangeAspect="1"/>
+            </wp:cNvGraphicFramePr>
+            <a:graphic xmlns:a="http://schemas.openxmlformats.org/drawingml/2006/main">
+              <a:graphicData uri="http://schemas.openxmlformats.org/drawingml/2006/picture">
+                <pic:pic xmlns:pic="http://schemas.openxmlformats.org/drawingml/2006/picture">
+                  <pic:nvPicPr>
+                    <pic:cNvPr id="1225564847" name=""/>
+                    <pic:cNvPicPr/>
+                  </pic:nvPicPr>
+                  <pic:blipFill>
+                    <a:blip r:embed="rId14"/>
+                    <a:stretch>
+                      <a:fillRect/>
+                    </a:stretch>
+                  </pic:blipFill>
+                  <pic:spPr>
+                    <a:xfrm>
+                      <a:off x="0" y="0"/>
+                      <a:ext cx="5731510" cy="3168015"/>
+                    </a:xfrm>
+                    <a:prstGeom prst="rect">
+                      <a:avLst/>
+                    </a:prstGeom>
+                  </pic:spPr>
+                </pic:pic>
+              </a:graphicData>
+            </a:graphic>
+          </wp:inline>
+        </w:drawing>
+      </w:r>
+    </w:p>
+    <w:p/>
+    <w:p/>
+    <w:p/>
+    <w:p/>
+    <w:p/>
+    <w:p>
+      <w:r>
+        <w:lastRenderedPageBreak/>
+        <w:drawing>
+          <wp:inline distT="0" distB="0" distL="0" distR="0" wp14:anchorId="1B822C34" wp14:editId="289AEC2B">
+            <wp:extent cx="5731510" cy="4102735"/>
+            <wp:effectExtent l="0" t="0" r="2540" b="0"/>
+            <wp:docPr id="909411803" name="Picture 1"/>
+            <wp:cNvGraphicFramePr>
+              <a:graphicFrameLocks xmlns:a="http://schemas.openxmlformats.org/drawingml/2006/main" noChangeAspect="1"/>
+            </wp:cNvGraphicFramePr>
+            <a:graphic xmlns:a="http://schemas.openxmlformats.org/drawingml/2006/main">
+              <a:graphicData uri="http://schemas.openxmlformats.org/drawingml/2006/picture">
+                <pic:pic xmlns:pic="http://schemas.openxmlformats.org/drawingml/2006/picture">
+                  <pic:nvPicPr>
+                    <pic:cNvPr id="909411803" name=""/>
+                    <pic:cNvPicPr/>
+                  </pic:nvPicPr>
+                  <pic:blipFill>
+                    <a:blip r:embed="rId15"/>
+                    <a:stretch>
+                      <a:fillRect/>
+                    </a:stretch>
+                  </pic:blipFill>
+                  <pic:spPr>
+                    <a:xfrm>
+                      <a:off x="0" y="0"/>
+                      <a:ext cx="5731510" cy="4102735"/>
+                    </a:xfrm>
+                    <a:prstGeom prst="rect">
+                      <a:avLst/>
+                    </a:prstGeom>
+                  </pic:spPr>
+                </pic:pic>
+              </a:graphicData>
+            </a:graphic>
+          </wp:inline>
+        </w:drawing>
+      </w:r>
+    </w:p>
+    <w:p/>
+    <w:p/>
+    <w:p>
+      <w:r>
+        <w:lastRenderedPageBreak/>
+        <w:drawing>
+          <wp:inline distT="0" distB="0" distL="0" distR="0" wp14:anchorId="254B7746" wp14:editId="3F6756E5">
+            <wp:extent cx="5731510" cy="4924425"/>
+            <wp:effectExtent l="0" t="0" r="2540" b="9525"/>
+            <wp:docPr id="2100890710" name="Picture 1"/>
+            <wp:cNvGraphicFramePr>
+              <a:graphicFrameLocks xmlns:a="http://schemas.openxmlformats.org/drawingml/2006/main" noChangeAspect="1"/>
+            </wp:cNvGraphicFramePr>
+            <a:graphic xmlns:a="http://schemas.openxmlformats.org/drawingml/2006/main">
+              <a:graphicData uri="http://schemas.openxmlformats.org/drawingml/2006/picture">
+                <pic:pic xmlns:pic="http://schemas.openxmlformats.org/drawingml/2006/picture">
+                  <pic:nvPicPr>
+                    <pic:cNvPr id="2100890710" name=""/>
+                    <pic:cNvPicPr/>
+                  </pic:nvPicPr>
+                  <pic:blipFill>
+                    <a:blip r:embed="rId16"/>
+                    <a:stretch>
+                      <a:fillRect/>
+                    </a:stretch>
+                  </pic:blipFill>
+                  <pic:spPr>
+                    <a:xfrm>
+                      <a:off x="0" y="0"/>
+                      <a:ext cx="5731510" cy="4924425"/>
+                    </a:xfrm>
+                    <a:prstGeom prst="rect">
+                      <a:avLst/>
+                    </a:prstGeom>
+                  </pic:spPr>
+                </pic:pic>
+              </a:graphicData>
+            </a:graphic>
+          </wp:inline>
+        </w:drawing>
+      </w:r>
+    </w:p>
+    <w:p/>
+    <w:p/>
+    <w:p/>
+    <w:p/>
+    <w:p>
+      <w:pPr>
+        <w:pStyle w:val="ListParagraph"/>
+      </w:pPr>
+    </w:p>
+    <w:p>
+      <w:pPr>
+        <w:pStyle w:val="ListParagraph"/>
+      </w:pPr>
+    </w:p>
+    <w:p/>
     <w:p/>
     <w:sectPr>
       <w:pgSz w:w="11906" w:h="16838"/>

</xml_diff>